<commit_message>
論文2 英文原稿 v2: 指標名を early amplitude ratio にそろえた（Upstroke amplitude ratio・upstroke ratio を改めた）。docx を作り直し、README_v2 変更 34・lab_log 追記163
- 方法の見出しと表1 の行、結果「波形の型」の 3 か所を early amplitude ratio に。含意の upstroke-only index に名を添えた
- 和文の「早期振幅比」・図表集の labels.json・用語表（Hellqvist 2024）と一致。数値は変えていない
- docx は build_en_docx.js で作り直し、文の差が上の 4 か所だけであることを確かめた

Co-Authored-By: Claude Opus 5.5 <noreply@anthropic.com>
Claude-Session: https://claude.ai/code/session_014EeswEG2Q8DPu944PwhYTP
</commit_message>
<xml_diff>
--- a/docs/manuscript/paper2/v2/paper2_draft_en_v2.docx
+++ b/docs/manuscript/paper2/v2/paper2_draft_en_v2.docx
@@ -5,7 +5,7 @@
     <w:p>
       <w:pPr>
         <w:pStyle w:val="Heading1"/>
-        <w:spacing w:before="280" w:after="140" w:line="276"/>
+        <w:spacing w:after="140" w:before="280" w:line="276"/>
       </w:pPr>
       <w:r>
         <w:rPr>
@@ -117,7 +117,7 @@
     <w:p>
       <w:pPr>
         <w:pStyle w:val="Heading2"/>
-        <w:spacing w:before="280" w:after="140" w:line="276"/>
+        <w:spacing w:after="140" w:before="280" w:line="276"/>
       </w:pPr>
       <w:r>
         <w:rPr>
@@ -173,7 +173,7 @@
     <w:p>
       <w:pPr>
         <w:pStyle w:val="Heading2"/>
-        <w:spacing w:before="280" w:after="140" w:line="276"/>
+        <w:spacing w:after="140" w:before="280" w:line="276"/>
       </w:pPr>
       <w:r>
         <w:rPr>
@@ -315,7 +315,7 @@
     <w:p>
       <w:pPr>
         <w:pStyle w:val="Heading2"/>
-        <w:spacing w:before="280" w:after="140" w:line="276"/>
+        <w:spacing w:after="140" w:before="280" w:line="276"/>
       </w:pPr>
       <w:r>
         <w:rPr>
@@ -538,7 +538,7 @@
     <w:p>
       <w:pPr>
         <w:pStyle w:val="Heading2"/>
-        <w:spacing w:before="280" w:after="140" w:line="276"/>
+        <w:spacing w:after="140" w:before="280" w:line="276"/>
       </w:pPr>
       <w:r>
         <w:rPr>
@@ -555,7 +555,7 @@
     <w:p>
       <w:pPr>
         <w:pStyle w:val="Heading3"/>
-        <w:spacing w:before="280" w:after="140" w:line="276"/>
+        <w:spacing w:after="140" w:before="280" w:line="276"/>
       </w:pPr>
       <w:r>
         <w:rPr>
@@ -734,7 +734,7 @@
     <w:p>
       <w:pPr>
         <w:pStyle w:val="Heading3"/>
-        <w:spacing w:before="280" w:after="140" w:line="276"/>
+        <w:spacing w:after="140" w:before="280" w:line="276"/>
       </w:pPr>
       <w:r>
         <w:rPr>
@@ -765,7 +765,7 @@
     <w:p>
       <w:pPr>
         <w:pStyle w:val="Heading3"/>
-        <w:spacing w:before="280" w:after="140" w:line="276"/>
+        <w:spacing w:after="140" w:before="280" w:line="276"/>
       </w:pPr>
       <w:r>
         <w:rPr>
@@ -949,7 +949,7 @@
           <w:sz w:val="22"/>
           <w:szCs w:val="22"/>
         </w:rPr>
-        <w:t xml:space="preserve">Upstroke amplitude ratio.</w:t>
+        <w:t xml:space="preserve">Early amplitude ratio.</w:t>
       </w:r>
       <w:r>
         <w:rPr>
@@ -978,7 +978,7 @@
     <w:p>
       <w:pPr>
         <w:pStyle w:val="Heading3"/>
-        <w:spacing w:before="280" w:after="140" w:line="276"/>
+        <w:spacing w:after="140" w:before="280" w:line="276"/>
       </w:pPr>
       <w:r>
         <w:rPr>
@@ -1249,7 +1249,7 @@
     <w:p>
       <w:pPr>
         <w:pStyle w:val="Heading3"/>
-        <w:spacing w:before="280" w:after="140" w:line="276"/>
+        <w:spacing w:after="140" w:before="280" w:line="276"/>
       </w:pPr>
       <w:r>
         <w:rPr>
@@ -1382,7 +1382,7 @@
     <w:p>
       <w:pPr>
         <w:pStyle w:val="Heading3"/>
-        <w:spacing w:before="280" w:after="140" w:line="276"/>
+        <w:spacing w:after="140" w:before="280" w:line="276"/>
       </w:pPr>
       <w:r>
         <w:rPr>
@@ -1413,7 +1413,7 @@
     <w:p>
       <w:pPr>
         <w:pStyle w:val="Heading3"/>
-        <w:spacing w:before="280" w:after="140" w:line="276"/>
+        <w:spacing w:after="140" w:before="280" w:line="276"/>
       </w:pPr>
       <w:r>
         <w:rPr>
@@ -1444,7 +1444,7 @@
     <w:p>
       <w:pPr>
         <w:pStyle w:val="Heading2"/>
-        <w:spacing w:before="280" w:after="140" w:line="276"/>
+        <w:spacing w:after="140" w:before="280" w:line="276"/>
       </w:pPr>
       <w:r>
         <w:rPr>
@@ -1461,7 +1461,7 @@
     <w:p>
       <w:pPr>
         <w:pStyle w:val="Heading3"/>
-        <w:spacing w:before="280" w:after="140" w:line="276"/>
+        <w:spacing w:after="140" w:before="280" w:line="276"/>
       </w:pPr>
       <w:r>
         <w:rPr>
@@ -1532,7 +1532,7 @@
     <w:p>
       <w:pPr>
         <w:pStyle w:val="Heading3"/>
-        <w:spacing w:before="280" w:after="140" w:line="276"/>
+        <w:spacing w:after="140" w:before="280" w:line="276"/>
       </w:pPr>
       <w:r>
         <w:rPr>
@@ -1573,7 +1573,7 @@
     </w:p>
     <w:tbl>
       <w:tblPr>
-        <w:tblW w:type="pct" w:w="100%"/>
+        <w:tblW w:type="pct" w:w="5000"/>
         <w:tblBorders>
           <w:top w:val="single" w:color="auto" w:sz="4"/>
           <w:left w:val="single" w:color="auto" w:sz="4"/>
@@ -1584,10 +1584,10 @@
         </w:tblBorders>
       </w:tblPr>
       <w:tblGrid>
-        <w:gridCol w:w="100"/>
-        <w:gridCol w:w="100"/>
-        <w:gridCol w:w="100"/>
-        <w:gridCol w:w="100"/>
+        <w:gridCol w:w="2268"/>
+        <w:gridCol w:w="2268"/>
+        <w:gridCol w:w="2268"/>
+        <w:gridCol w:w="2268"/>
       </w:tblGrid>
       <w:tr>
         <w:trPr>
@@ -1724,7 +1724,7 @@
       </w:tr>
       <w:tr>
         <w:trPr>
-          <w:tblHeader w:val="false"/>
+          <w:tblHeader w:val="off"/>
         </w:trPr>
         <w:tc>
           <w:tcPr>
@@ -1849,7 +1849,7 @@
       </w:tr>
       <w:tr>
         <w:trPr>
-          <w:tblHeader w:val="false"/>
+          <w:tblHeader w:val="off"/>
         </w:trPr>
         <w:tc>
           <w:tcPr>
@@ -1974,7 +1974,7 @@
       </w:tr>
       <w:tr>
         <w:trPr>
-          <w:tblHeader w:val="false"/>
+          <w:tblHeader w:val="off"/>
         </w:trPr>
         <w:tc>
           <w:tcPr>
@@ -2099,7 +2099,7 @@
       </w:tr>
       <w:tr>
         <w:trPr>
-          <w:tblHeader w:val="false"/>
+          <w:tblHeader w:val="off"/>
         </w:trPr>
         <w:tc>
           <w:tcPr>
@@ -2232,7 +2232,7 @@
       </w:tr>
       <w:tr>
         <w:trPr>
-          <w:tblHeader w:val="false"/>
+          <w:tblHeader w:val="off"/>
         </w:trPr>
         <w:tc>
           <w:tcPr>
@@ -2262,7 +2262,7 @@
                 <w:sz w:val="22"/>
                 <w:szCs w:val="22"/>
               </w:rPr>
-              <w:t xml:space="preserve">Upstroke amplitude ratio Am_b/Am_p1</w:t>
+              <w:t xml:space="preserve">Early amplitude ratio Am_b/Am_p1</w:t>
             </w:r>
           </w:p>
         </w:tc>
@@ -2363,7 +2363,7 @@
       </w:tr>
       <w:tr>
         <w:trPr>
-          <w:tblHeader w:val="false"/>
+          <w:tblHeader w:val="off"/>
         </w:trPr>
         <w:tc>
           <w:tcPr>
@@ -2597,7 +2597,7 @@
     <w:p>
       <w:pPr>
         <w:pStyle w:val="Heading3"/>
-        <w:spacing w:before="280" w:after="140" w:line="276"/>
+        <w:spacing w:after="140" w:before="280" w:line="276"/>
       </w:pPr>
       <w:r>
         <w:rPr>
@@ -2829,7 +2829,7 @@
     <w:p>
       <w:pPr>
         <w:pStyle w:val="Heading3"/>
-        <w:spacing w:before="280" w:after="140" w:line="276"/>
+        <w:spacing w:after="140" w:before="280" w:line="276"/>
       </w:pPr>
       <w:r>
         <w:rPr>
@@ -2859,7 +2859,7 @@
     </w:p>
     <w:tbl>
       <w:tblPr>
-        <w:tblW w:type="pct" w:w="100%"/>
+        <w:tblW w:type="pct" w:w="5000"/>
         <w:tblBorders>
           <w:top w:val="single" w:color="auto" w:sz="4"/>
           <w:left w:val="single" w:color="auto" w:sz="4"/>
@@ -2870,10 +2870,10 @@
         </w:tblBorders>
       </w:tblPr>
       <w:tblGrid>
-        <w:gridCol w:w="100"/>
-        <w:gridCol w:w="100"/>
-        <w:gridCol w:w="100"/>
-        <w:gridCol w:w="100"/>
+        <w:gridCol w:w="2268"/>
+        <w:gridCol w:w="2268"/>
+        <w:gridCol w:w="2268"/>
+        <w:gridCol w:w="2268"/>
       </w:tblGrid>
       <w:tr>
         <w:trPr>
@@ -3010,7 +3010,7 @@
       </w:tr>
       <w:tr>
         <w:trPr>
-          <w:tblHeader w:val="false"/>
+          <w:tblHeader w:val="off"/>
         </w:trPr>
         <w:tc>
           <w:tcPr>
@@ -3135,7 +3135,7 @@
       </w:tr>
       <w:tr>
         <w:trPr>
-          <w:tblHeader w:val="false"/>
+          <w:tblHeader w:val="off"/>
         </w:trPr>
         <w:tc>
           <w:tcPr>
@@ -3264,7 +3264,7 @@
       </w:tr>
       <w:tr>
         <w:trPr>
-          <w:tblHeader w:val="false"/>
+          <w:tblHeader w:val="off"/>
         </w:trPr>
         <w:tc>
           <w:tcPr>
@@ -3389,7 +3389,7 @@
       </w:tr>
       <w:tr>
         <w:trPr>
-          <w:tblHeader w:val="false"/>
+          <w:tblHeader w:val="off"/>
         </w:trPr>
         <w:tc>
           <w:tcPr>
@@ -3514,7 +3514,7 @@
       </w:tr>
       <w:tr>
         <w:trPr>
-          <w:tblHeader w:val="false"/>
+          <w:tblHeader w:val="off"/>
         </w:trPr>
         <w:tc>
           <w:tcPr>
@@ -3647,7 +3647,7 @@
       </w:tr>
       <w:tr>
         <w:trPr>
-          <w:tblHeader w:val="false"/>
+          <w:tblHeader w:val="off"/>
         </w:trPr>
         <w:tc>
           <w:tcPr>
@@ -3813,7 +3813,7 @@
     <w:p>
       <w:pPr>
         <w:pStyle w:val="Heading3"/>
-        <w:spacing w:before="280" w:after="140" w:line="276"/>
+        <w:spacing w:after="140" w:before="280" w:line="276"/>
       </w:pPr>
       <w:r>
         <w:rPr>
@@ -3869,7 +3869,7 @@
     <w:p>
       <w:pPr>
         <w:pStyle w:val="Heading3"/>
-        <w:spacing w:before="280" w:after="140" w:line="276"/>
+        <w:spacing w:after="140" w:before="280" w:line="276"/>
       </w:pPr>
       <w:r>
         <w:rPr>
@@ -3894,7 +3894,7 @@
           <w:sz w:val="22"/>
           <w:szCs w:val="22"/>
         </w:rPr>
-        <w:t xml:space="preserve">Waveform types were: type 1 (notch present) 891 (20.4%), type 3 (inflection only) 3,378 (77.2%), type 4 (neither) 105 (2.4%). Our detection separates the types only by the presence of a notch and of an inflection on the descending limb, so Dawber types 2 and 3 are both counted as type 3, and these three types account for all 4,374 subjects. The rebuilt decomposition accepts only type 1 beats by rule, so its verdicts rest on type 1. The Wang acceptance criterion decides a fit by whether the fitted components reproduce the positions of the measured fiducial points (the notch and the diastolic peak), so it cannot be applied to beats that have neither; for tiers A and B of the rebuilt version the rule therefore gives up the very advantage of decomposition, that it returns a value in beats without a notch. Type 3 was read with fiducial points (the inflection standing in for the diastolic peak), the p1 construction and the upstroke ratio. The frozen decomposition has no such rule and was fitted to all subjects regardless of type, so how decomposition performs in beats without a notch is read from the frozen version and from tier C.</w:t>
+        <w:t xml:space="preserve">Waveform types were: type 1 (notch present) 891 (20.4%), type 3 (inflection only) 3,378 (77.2%), type 4 (neither) 105 (2.4%). Our detection separates the types only by the presence of a notch and of an inflection on the descending limb, so Dawber types 2 and 3 are both counted as type 3, and these three types account for all 4,374 subjects. The rebuilt decomposition accepts only type 1 beats by rule, so its verdicts rest on type 1. The Wang acceptance criterion decides a fit by whether the fitted components reproduce the positions of the measured fiducial points (the notch and the diastolic peak), so it cannot be applied to beats that have neither; for tiers A and B of the rebuilt version the rule therefore gives up the very advantage of decomposition, that it returns a value in beats without a notch. Type 3 was read with fiducial points (the inflection standing in for the diastolic peak), the p1 construction and the early amplitude ratio. The frozen decomposition has no such rule and was fitted to all subjects regardless of type, so how decomposition performs in beats without a notch is read from the frozen version and from tier C.</w:t>
       </w:r>
     </w:p>
     <w:p>
@@ -3934,7 +3934,7 @@
     <w:p>
       <w:pPr>
         <w:pStyle w:val="Heading2"/>
-        <w:spacing w:before="280" w:after="140" w:line="276"/>
+        <w:spacing w:after="140" w:before="280" w:line="276"/>
       </w:pPr>
       <w:r>
         <w:rPr>
@@ -3951,7 +3951,7 @@
     <w:p>
       <w:pPr>
         <w:pStyle w:val="Heading3"/>
-        <w:spacing w:before="280" w:after="140" w:line="276"/>
+        <w:spacing w:after="140" w:before="280" w:line="276"/>
       </w:pPr>
       <w:r>
         <w:rPr>
@@ -4056,7 +4056,7 @@
     <w:p>
       <w:pPr>
         <w:pStyle w:val="Heading3"/>
-        <w:spacing w:before="280" w:after="140" w:line="276"/>
+        <w:spacing w:after="140" w:before="280" w:line="276"/>
       </w:pPr>
       <w:r>
         <w:rPr>
@@ -4175,7 +4175,7 @@
     <w:p>
       <w:pPr>
         <w:pStyle w:val="Heading3"/>
-        <w:spacing w:before="280" w:after="140" w:line="276"/>
+        <w:spacing w:after="140" w:before="280" w:line="276"/>
       </w:pPr>
       <w:r>
         <w:rPr>
@@ -4424,7 +4424,7 @@
     <w:p>
       <w:pPr>
         <w:pStyle w:val="Heading3"/>
-        <w:spacing w:before="280" w:after="140" w:line="276"/>
+        <w:spacing w:after="140" w:before="280" w:line="276"/>
       </w:pPr>
       <w:r>
         <w:rPr>
@@ -4480,7 +4480,7 @@
     <w:p>
       <w:pPr>
         <w:pStyle w:val="Heading3"/>
-        <w:spacing w:before="280" w:after="140" w:line="276"/>
+        <w:spacing w:after="140" w:before="280" w:line="276"/>
       </w:pPr>
       <w:r>
         <w:rPr>
@@ -4571,7 +4571,7 @@
     <w:p>
       <w:pPr>
         <w:pStyle w:val="Heading3"/>
-        <w:spacing w:before="280" w:after="140" w:line="276"/>
+        <w:spacing w:after="140" w:before="280" w:line="276"/>
       </w:pPr>
       <w:r>
         <w:rPr>
@@ -4616,13 +4616,13 @@
           <w:sz w:val="22"/>
           <w:szCs w:val="22"/>
         </w:rPr>
-        <w:t xml:space="preserve">, and that checking construct validity — whether an index measures the quantity it is meant to measure — against known truth is cheap: the database is open and the analysis takes hours. Where the dicrotic notch is unavailable, an upstroke-only index is an alternative that requires no diastolic feature and, in this population, outperformed both families (0.836).</w:t>
+        <w:t xml:space="preserve">, and that checking construct validity — whether an index measures the quantity it is meant to measure — against known truth is cheap: the database is open and the analysis takes hours. Where the dicrotic notch is unavailable, an upstroke-only index such as the early amplitude ratio is an alternative that requires no diastolic feature and, in this population, outperformed both families (0.836).</w:t>
       </w:r>
     </w:p>
     <w:p>
       <w:pPr>
         <w:pStyle w:val="Heading2"/>
-        <w:spacing w:before="280" w:after="140" w:line="276"/>
+        <w:spacing w:after="140" w:before="280" w:line="276"/>
       </w:pPr>
       <w:r>
         <w:rPr>
@@ -4653,7 +4653,7 @@
     <w:p>
       <w:pPr>
         <w:pStyle w:val="Heading2"/>
-        <w:spacing w:before="280" w:after="140" w:line="276"/>
+        <w:spacing w:after="140" w:before="280" w:line="276"/>
       </w:pPr>
       <w:r>
         <w:rPr>
@@ -4759,7 +4759,7 @@
     <w:p>
       <w:pPr>
         <w:pStyle w:val="Heading2"/>
-        <w:spacing w:before="280" w:after="140" w:line="276"/>
+        <w:spacing w:after="140" w:before="280" w:line="276"/>
       </w:pPr>
       <w:r>
         <w:rPr>
@@ -4881,7 +4881,7 @@
     <w:p>
       <w:pPr>
         <w:pStyle w:val="Heading2"/>
-        <w:spacing w:before="280" w:after="140" w:line="276"/>
+        <w:spacing w:after="140" w:before="280" w:line="276"/>
       </w:pPr>
       <w:r>
         <w:rPr>
@@ -5310,8 +5310,41 @@
 </w:document>
 </file>
 
-<file path=word/comments.xml><?xml version="1.0" encoding="utf-8"?>
-<w:comments xmlns:cx="http://schemas.microsoft.com/office/drawing/2014/chartex" xmlns:cx1="http://schemas.microsoft.com/office/drawing/2015/9/8/chartex" xmlns:cx2="http://schemas.microsoft.com/office/drawing/2015/10/21/chartex" xmlns:cx3="http://schemas.microsoft.com/office/drawing/2016/5/9/chartex" xmlns:cx4="http://schemas.microsoft.com/office/drawing/2016/5/10/chartex" xmlns:cx5="http://schemas.microsoft.com/office/drawing/2016/5/11/chartex" xmlns:cx6="http://schemas.microsoft.com/office/drawing/2016/5/12/chartex" xmlns:cx7="http://schemas.microsoft.com/office/drawing/2016/5/13/chartex" xmlns:cx8="http://schemas.microsoft.com/office/drawing/2016/5/14/chartex" xmlns:mc="http://schemas.openxmlformats.org/markup-compatibility/2006" xmlns:aink="http://schemas.microsoft.com/office/drawing/2016/ink" xmlns:am3d="http://schemas.microsoft.com/office/drawing/2017/model3d" xmlns:o="urn:schemas-microsoft-com:office:office" xmlns:r="http://schemas.openxmlformats.org/officeDocument/2006/relationships" xmlns:m="http://schemas.openxmlformats.org/officeDocument/2006/math" xmlns:v="urn:schemas-microsoft-com:vml" xmlns:wp14="http://schemas.microsoft.com/office/word/2010/wordprocessingDrawing" xmlns:wp="http://schemas.openxmlformats.org/drawingml/2006/wordprocessingDrawing" xmlns:w10="urn:schemas-microsoft-com:office:word" xmlns:w="http://schemas.openxmlformats.org/wordprocessingml/2006/main" xmlns:w14="http://schemas.microsoft.com/office/word/2010/wordml" xmlns:w15="http://schemas.microsoft.com/office/word/2012/wordml" xmlns:w16cex="http://schemas.microsoft.com/office/word/2018/wordml/cex" xmlns:w16cid="http://schemas.microsoft.com/office/word/2016/wordml/cid" xmlns:w16="http://schemas.microsoft.com/office/word/2018/wordml" xmlns:w16sdtdh="http://schemas.microsoft.com/office/word/2020/wordml/sdtdatahash" xmlns:w16se="http://schemas.microsoft.com/office/word/2015/wordml/symex" xmlns:wpg="http://schemas.microsoft.com/office/word/2010/wordprocessingGroup" xmlns:wpi="http://schemas.microsoft.com/office/word/2010/wordprocessingInk" xmlns:wne="http://schemas.microsoft.com/office/word/2006/wordml" xmlns:wps="http://schemas.microsoft.com/office/word/2010/wordprocessingShape"/>
+<file path=word/endnotes.xml><?xml version="1.0" encoding="utf-8"?>
+<w:endnotes xmlns:wpc="http://schemas.microsoft.com/office/word/2010/wordprocessingCanvas" xmlns:mc="http://schemas.openxmlformats.org/markup-compatibility/2006" xmlns:o="urn:schemas-microsoft-com:office:office" xmlns:r="http://schemas.openxmlformats.org/officeDocument/2006/relationships" xmlns:m="http://schemas.openxmlformats.org/officeDocument/2006/math" xmlns:v="urn:schemas-microsoft-com:vml" xmlns:wp14="http://schemas.microsoft.com/office/word/2010/wordprocessingDrawing" xmlns:wp="http://schemas.openxmlformats.org/drawingml/2006/wordprocessingDrawing" xmlns:w10="urn:schemas-microsoft-com:office:word" xmlns:w="http://schemas.openxmlformats.org/wordprocessingml/2006/main" xmlns:w14="http://schemas.microsoft.com/office/word/2010/wordml" xmlns:w15="http://schemas.microsoft.com/office/word/2012/wordml" xmlns:wpg="http://schemas.microsoft.com/office/word/2010/wordprocessingGroup" xmlns:wpi="http://schemas.microsoft.com/office/word/2010/wordprocessingInk" xmlns:wne="http://schemas.microsoft.com/office/word/2006/wordml" xmlns:wps="http://schemas.microsoft.com/office/word/2010/wordprocessingShape" mc:Ignorable="w14 w15 wp14">
+  <w:endnote w:type="separator" w:id="-1">
+    <w:p>
+      <w:pPr>
+        <w:spacing w:after="0" w:line="240" w:lineRule="auto"/>
+      </w:pPr>
+      <w:r>
+        <w:rPr>
+          <w:rStyle w:val="EndnoteReference"/>
+        </w:rPr>
+        <w:endnoteRef/>
+      </w:r>
+      <w:r>
+        <w:separator/>
+      </w:r>
+    </w:p>
+  </w:endnote>
+  <w:endnote w:type="continuationSeparator" w:id="0">
+    <w:p>
+      <w:pPr>
+        <w:spacing w:after="0" w:line="240" w:lineRule="auto"/>
+      </w:pPr>
+      <w:r>
+        <w:rPr>
+          <w:rStyle w:val="EndnoteReference"/>
+        </w:rPr>
+        <w:endnoteRef/>
+      </w:r>
+      <w:r>
+        <w:continuationSeparator/>
+      </w:r>
+    </w:p>
+  </w:endnote>
+</w:endnotes>
 </file>
 
 <file path=word/footer1.xml><?xml version="1.0" encoding="utf-8"?>
@@ -5377,7 +5410,7 @@
 <w:numbering xmlns:wpc="http://schemas.microsoft.com/office/word/2010/wordprocessingCanvas" xmlns:mc="http://schemas.openxmlformats.org/markup-compatibility/2006" xmlns:o="urn:schemas-microsoft-com:office:office" xmlns:r="http://schemas.openxmlformats.org/officeDocument/2006/relationships" xmlns:m="http://schemas.openxmlformats.org/officeDocument/2006/math" xmlns:v="urn:schemas-microsoft-com:vml" xmlns:wp14="http://schemas.microsoft.com/office/word/2010/wordprocessingDrawing" xmlns:wp="http://schemas.openxmlformats.org/drawingml/2006/wordprocessingDrawing" xmlns:w10="urn:schemas-microsoft-com:office:word" xmlns:w="http://schemas.openxmlformats.org/wordprocessingml/2006/main" xmlns:w14="http://schemas.microsoft.com/office/word/2010/wordml" xmlns:w15="http://schemas.microsoft.com/office/word/2012/wordml" xmlns:wpg="http://schemas.microsoft.com/office/word/2010/wordprocessingGroup" xmlns:wpi="http://schemas.microsoft.com/office/word/2010/wordprocessingInk" xmlns:wne="http://schemas.microsoft.com/office/word/2006/wordml" xmlns:wps="http://schemas.microsoft.com/office/word/2010/wordprocessingShape" mc:Ignorable="w14 w15 wp14">
   <w:abstractNum w:abstractNumId="1" w15:restartNumberingAfterBreak="0">
     <w:multiLevelType w:val="hybridMultilevel"/>
-    <w:lvl w:ilvl="0" w15:tentative="1">
+    <w:lvl w:ilvl="0" w:tentative="1">
       <w:start w:val="1"/>
       <w:numFmt w:val="bullet"/>
       <w:lvlText w:val="●"/>
@@ -5386,7 +5419,7 @@
         <w:ind w:left="720" w:hanging="360"/>
       </w:pPr>
     </w:lvl>
-    <w:lvl w:ilvl="1" w15:tentative="1">
+    <w:lvl w:ilvl="1" w:tentative="1">
       <w:start w:val="1"/>
       <w:numFmt w:val="bullet"/>
       <w:lvlText w:val="○"/>
@@ -5395,7 +5428,7 @@
         <w:ind w:left="1440" w:hanging="360"/>
       </w:pPr>
     </w:lvl>
-    <w:lvl w:ilvl="2" w15:tentative="1">
+    <w:lvl w:ilvl="2" w:tentative="1">
       <w:start w:val="1"/>
       <w:numFmt w:val="bullet"/>
       <w:lvlText w:val="■"/>
@@ -5404,7 +5437,7 @@
         <w:ind w:left="2160" w:hanging="360"/>
       </w:pPr>
     </w:lvl>
-    <w:lvl w:ilvl="3" w15:tentative="1">
+    <w:lvl w:ilvl="3" w:tentative="1">
       <w:start w:val="1"/>
       <w:numFmt w:val="bullet"/>
       <w:lvlText w:val="●"/>
@@ -5413,7 +5446,7 @@
         <w:ind w:left="2880" w:hanging="360"/>
       </w:pPr>
     </w:lvl>
-    <w:lvl w:ilvl="4" w15:tentative="1">
+    <w:lvl w:ilvl="4" w:tentative="1">
       <w:start w:val="1"/>
       <w:numFmt w:val="bullet"/>
       <w:lvlText w:val="○"/>
@@ -5422,7 +5455,7 @@
         <w:ind w:left="3600" w:hanging="360"/>
       </w:pPr>
     </w:lvl>
-    <w:lvl w:ilvl="5" w15:tentative="1">
+    <w:lvl w:ilvl="5" w:tentative="1">
       <w:start w:val="1"/>
       <w:numFmt w:val="bullet"/>
       <w:lvlText w:val="■"/>
@@ -5431,7 +5464,7 @@
         <w:ind w:left="4320" w:hanging="360"/>
       </w:pPr>
     </w:lvl>
-    <w:lvl w:ilvl="6" w15:tentative="1">
+    <w:lvl w:ilvl="6" w:tentative="1">
       <w:start w:val="1"/>
       <w:numFmt w:val="bullet"/>
       <w:lvlText w:val="●"/>
@@ -5440,7 +5473,7 @@
         <w:ind w:left="5040" w:hanging="360"/>
       </w:pPr>
     </w:lvl>
-    <w:lvl w:ilvl="7" w15:tentative="1">
+    <w:lvl w:ilvl="7" w:tentative="1">
       <w:start w:val="1"/>
       <w:numFmt w:val="bullet"/>
       <w:lvlText w:val="●"/>
@@ -5449,7 +5482,7 @@
         <w:ind w:left="5760" w:hanging="360"/>
       </w:pPr>
     </w:lvl>
-    <w:lvl w:ilvl="8" w15:tentative="1">
+    <w:lvl w:ilvl="8" w:tentative="1">
       <w:start w:val="1"/>
       <w:numFmt w:val="bullet"/>
       <w:lvlText w:val="●"/>
@@ -5481,6 +5514,10 @@
     </w:rPrDefault>
     <w:pPrDefault/>
   </w:docDefaults>
+  <w:style w:type="paragraph" w:styleId="Normal" w:default="1">
+    <w:name w:val="Normal"/>
+    <w:qFormat/>
+  </w:style>
   <w:style w:type="paragraph" w:styleId="Title">
     <w:name w:val="Title"/>
     <w:basedOn w:val="Normal"/>
@@ -5615,5 +5652,332 @@
       <w:szCs w:val="20"/>
     </w:rPr>
   </w:style>
+  <w:style w:type="character" w:styleId="EndnoteReference">
+    <w:name w:val="endnote reference"/>
+    <w:basedOn w:val="DefaultParagraphFont"/>
+    <w:uiPriority w:val="99"/>
+    <w:semiHidden/>
+    <w:unhideWhenUsed/>
+    <w:rPr>
+      <w:vertAlign w:val="superscript"/>
+    </w:rPr>
+  </w:style>
+  <w:style w:type="paragraph" w:styleId="EndnoteText">
+    <w:name w:val="endnote text"/>
+    <w:basedOn w:val="Normal"/>
+    <w:link w:val="EndnoteTextChar"/>
+    <w:uiPriority w:val="99"/>
+    <w:semiHidden/>
+    <w:unhideWhenUsed/>
+    <w:pPr>
+      <w:spacing w:after="0" w:line="240" w:lineRule="auto"/>
+    </w:pPr>
+    <w:rPr>
+      <w:sz w:val="20"/>
+      <w:szCs w:val="20"/>
+    </w:rPr>
+  </w:style>
+  <w:style w:type="character" w:styleId="EndnoteTextChar">
+    <w:name w:val="Endnote Text Char"/>
+    <w:basedOn w:val="DefaultParagraphFont"/>
+    <w:link w:val="EndnoteText"/>
+    <w:uiPriority w:val="99"/>
+    <w:semiHidden/>
+    <w:unhideWhenUsed/>
+    <w:rPr>
+      <w:sz w:val="20"/>
+      <w:szCs w:val="20"/>
+    </w:rPr>
+  </w:style>
 </w:styles>
+</file>
+
+<file path=word/theme/theme1.xml><?xml version="1.0" encoding="utf-8"?>
+<a:theme xmlns:a="http://schemas.openxmlformats.org/drawingml/2006/main" name="Office Theme">
+  <a:themeElements>
+    <a:clrScheme name="Office">
+      <a:dk1>
+        <a:sysClr val="windowText" lastClr="000000"/>
+      </a:dk1>
+      <a:lt1>
+        <a:sysClr val="window" lastClr="FFFFFF"/>
+      </a:lt1>
+      <a:dk2>
+        <a:srgbClr val="44546A"/>
+      </a:dk2>
+      <a:lt2>
+        <a:srgbClr val="E7E6E6"/>
+      </a:lt2>
+      <a:accent1>
+        <a:srgbClr val="4472C4"/>
+      </a:accent1>
+      <a:accent2>
+        <a:srgbClr val="ED7D31"/>
+      </a:accent2>
+      <a:accent3>
+        <a:srgbClr val="A5A5A5"/>
+      </a:accent3>
+      <a:accent4>
+        <a:srgbClr val="FFC000"/>
+      </a:accent4>
+      <a:accent5>
+        <a:srgbClr val="5B9BD5"/>
+      </a:accent5>
+      <a:accent6>
+        <a:srgbClr val="70AD47"/>
+      </a:accent6>
+      <a:hlink>
+        <a:srgbClr val="0563C1"/>
+      </a:hlink>
+      <a:folHlink>
+        <a:srgbClr val="954F72"/>
+      </a:folHlink>
+    </a:clrScheme>
+    <a:fontScheme name="Office">
+      <a:majorFont>
+        <a:latin typeface="Calibri Light" panose="020F0302020204030204"/>
+        <a:ea typeface=""/>
+        <a:cs typeface=""/>
+        <a:font script="Jpan" typeface="游ゴシック Light"/>
+        <a:font script="Hang" typeface="맑은 고딕"/>
+        <a:font script="Hans" typeface="等线 Light"/>
+        <a:font script="Hant" typeface="新細明體"/>
+        <a:font script="Arab" typeface="Times New Roman"/>
+        <a:font script="Hebr" typeface="Times New Roman"/>
+        <a:font script="Thai" typeface="Angsana New"/>
+        <a:font script="Ethi" typeface="Nyala"/>
+        <a:font script="Beng" typeface="Vrinda"/>
+        <a:font script="Gujr" typeface="Shruti"/>
+        <a:font script="Khmr" typeface="MoolBoran"/>
+        <a:font script="Knda" typeface="Tunga"/>
+        <a:font script="Guru" typeface="Raavi"/>
+        <a:font script="Cans" typeface="Euphemia"/>
+        <a:font script="Cher" typeface="Plantagenet Cherokee"/>
+        <a:font script="Yiii" typeface="Microsoft Yi Baiti"/>
+        <a:font script="Tibt" typeface="Microsoft Himalaya"/>
+        <a:font script="Thaa" typeface="MV Boli"/>
+        <a:font script="Deva" typeface="Mangal"/>
+        <a:font script="Telu" typeface="Gautami"/>
+        <a:font script="Taml" typeface="Latha"/>
+        <a:font script="Syrc" typeface="Estrangelo Edessa"/>
+        <a:font script="Orya" typeface="Kalinga"/>
+        <a:font script="Mlym" typeface="Kartika"/>
+        <a:font script="Laoo" typeface="DokChampa"/>
+        <a:font script="Sinh" typeface="Iskoola Pota"/>
+        <a:font script="Mong" typeface="Mongolian Baiti"/>
+        <a:font script="Viet" typeface="Times New Roman"/>
+        <a:font script="Uigh" typeface="Microsoft Uighur"/>
+        <a:font script="Geor" typeface="Sylfaen"/>
+        <a:font script="Armn" typeface="Arial"/>
+        <a:font script="Bugi" typeface="Leelawadee UI"/>
+        <a:font script="Bopo" typeface="Microsoft JhengHei"/>
+        <a:font script="Java" typeface="Javanese Text"/>
+        <a:font script="Lisu" typeface="Segoe UI"/>
+        <a:font script="Mymr" typeface="Myanmar Text"/>
+        <a:font script="Nkoo" typeface="Ebrima"/>
+        <a:font script="Olck" typeface="Nirmala UI"/>
+        <a:font script="Osma" typeface="Ebrima"/>
+        <a:font script="Phag" typeface="Phagspa"/>
+        <a:font script="Syrn" typeface="Estrangelo Edessa"/>
+        <a:font script="Syrj" typeface="Estrangelo Edessa"/>
+        <a:font script="Syre" typeface="Estrangelo Edessa"/>
+        <a:font script="Sora" typeface="Nirmala UI"/>
+        <a:font script="Tale" typeface="Microsoft Tai Le"/>
+        <a:font script="Talu" typeface="Microsoft New Tai Lue"/>
+        <a:font script="Tfng" typeface="Ebrima"/>
+      </a:majorFont>
+      <a:minorFont>
+        <a:latin typeface="Calibri" panose="020F0502020204030204"/>
+        <a:ea typeface=""/>
+        <a:cs typeface=""/>
+        <a:font script="Jpan" typeface="游明朝"/>
+        <a:font script="Hang" typeface="맑은 고딕"/>
+        <a:font script="Hans" typeface="等线"/>
+        <a:font script="Hant" typeface="新細明體"/>
+        <a:font script="Arab" typeface="Arial"/>
+        <a:font script="Hebr" typeface="Arial"/>
+        <a:font script="Thai" typeface="Cordia New"/>
+        <a:font script="Ethi" typeface="Nyala"/>
+        <a:font script="Beng" typeface="Vrinda"/>
+        <a:font script="Gujr" typeface="Shruti"/>
+        <a:font script="Khmr" typeface="DaunPenh"/>
+        <a:font script="Knda" typeface="Tunga"/>
+        <a:font script="Guru" typeface="Raavi"/>
+        <a:font script="Cans" typeface="Euphemia"/>
+        <a:font script="Cher" typeface="Plantagenet Cherokee"/>
+        <a:font script="Yiii" typeface="Microsoft Yi Baiti"/>
+        <a:font script="Tibt" typeface="Microsoft Himalaya"/>
+        <a:font script="Thaa" typeface="MV Boli"/>
+        <a:font script="Deva" typeface="Mangal"/>
+        <a:font script="Telu" typeface="Gautami"/>
+        <a:font script="Taml" typeface="Latha"/>
+        <a:font script="Syrc" typeface="Estrangelo Edessa"/>
+        <a:font script="Orya" typeface="Kalinga"/>
+        <a:font script="Mlym" typeface="Kartika"/>
+        <a:font script="Laoo" typeface="DokChampa"/>
+        <a:font script="Sinh" typeface="Iskoola Pota"/>
+        <a:font script="Mong" typeface="Mongolian Baiti"/>
+        <a:font script="Viet" typeface="Arial"/>
+        <a:font script="Uigh" typeface="Microsoft Uighur"/>
+        <a:font script="Geor" typeface="Sylfaen"/>
+        <a:font script="Armn" typeface="Arial"/>
+        <a:font script="Bugi" typeface="Leelawadee UI"/>
+        <a:font script="Bopo" typeface="Microsoft JhengHei"/>
+        <a:font script="Java" typeface="Javanese Text"/>
+        <a:font script="Lisu" typeface="Segoe UI"/>
+        <a:font script="Mymr" typeface="Myanmar Text"/>
+        <a:font script="Nkoo" typeface="Ebrima"/>
+        <a:font script="Olck" typeface="Nirmala UI"/>
+        <a:font script="Osma" typeface="Ebrima"/>
+        <a:font script="Phag" typeface="Phagspa"/>
+        <a:font script="Syrn" typeface="Estrangelo Edessa"/>
+        <a:font script="Syrj" typeface="Estrangelo Edessa"/>
+        <a:font script="Syre" typeface="Estrangelo Edessa"/>
+        <a:font script="Sora" typeface="Nirmala UI"/>
+        <a:font script="Tale" typeface="Microsoft Tai Le"/>
+        <a:font script="Talu" typeface="Microsoft New Tai Lue"/>
+        <a:font script="Tfng" typeface="Ebrima"/>
+      </a:minorFont>
+    </a:fontScheme>
+    <a:fmtScheme name="Office">
+      <a:fillStyleLst>
+        <a:solidFill>
+          <a:schemeClr val="phClr"/>
+        </a:solidFill>
+        <a:gradFill rotWithShape="true">
+          <a:gsLst>
+            <a:gs pos="0">
+              <a:schemeClr val="phClr">
+                <a:lumMod val="110000"/>
+                <a:satMod val="105000"/>
+                <a:tint val="67000"/>
+              </a:schemeClr>
+            </a:gs>
+            <a:gs pos="50000">
+              <a:schemeClr val="phClr">
+                <a:lumMod val="105000"/>
+                <a:satMod val="103000"/>
+                <a:tint val="73000"/>
+              </a:schemeClr>
+            </a:gs>
+            <a:gs pos="100000">
+              <a:schemeClr val="phClr">
+                <a:lumMod val="105000"/>
+                <a:satMod val="109000"/>
+                <a:tint val="81000"/>
+              </a:schemeClr>
+            </a:gs>
+          </a:gsLst>
+          <a:lin ang="5400000" scaled="false"/>
+        </a:gradFill>
+        <a:gradFill rotWithShape="true">
+          <a:gsLst>
+            <a:gs pos="0">
+              <a:schemeClr val="phClr">
+                <a:satMod val="103000"/>
+                <a:lumMod val="102000"/>
+                <a:tint val="94000"/>
+              </a:schemeClr>
+            </a:gs>
+            <a:gs pos="50000">
+              <a:schemeClr val="phClr">
+                <a:satMod val="110000"/>
+                <a:lumMod val="100000"/>
+                <a:shade val="100000"/>
+              </a:schemeClr>
+            </a:gs>
+            <a:gs pos="100000">
+              <a:schemeClr val="phClr">
+                <a:lumMod val="99000"/>
+                <a:satMod val="120000"/>
+                <a:shade val="78000"/>
+              </a:schemeClr>
+            </a:gs>
+          </a:gsLst>
+          <a:lin ang="5400000" scaled="false"/>
+        </a:gradFill>
+      </a:fillStyleLst>
+      <a:lnStyleLst>
+        <a:ln w="6350" cap="flat" cmpd="sng" algn="ctr">
+          <a:solidFill>
+            <a:schemeClr val="phClr"/>
+          </a:solidFill>
+          <a:prstDash val="solid"/>
+          <a:miter lim="800000"/>
+        </a:ln>
+        <a:ln w="12700" cap="flat" cmpd="sng" algn="ctr">
+          <a:solidFill>
+            <a:schemeClr val="phClr"/>
+          </a:solidFill>
+          <a:prstDash val="solid"/>
+          <a:miter lim="800000"/>
+        </a:ln>
+        <a:ln w="19050" cap="flat" cmpd="sng" algn="ctr">
+          <a:solidFill>
+            <a:schemeClr val="phClr"/>
+          </a:solidFill>
+          <a:prstDash val="solid"/>
+          <a:miter lim="800000"/>
+        </a:ln>
+      </a:lnStyleLst>
+      <a:effectStyleLst>
+        <a:effectStyle>
+          <a:effectLst/>
+        </a:effectStyle>
+        <a:effectStyle>
+          <a:effectLst/>
+        </a:effectStyle>
+        <a:effectStyle>
+          <a:effectLst>
+            <a:outerShdw blurRad="57150" dist="19050" dir="5400000" algn="ctr" rotWithShape="false">
+              <a:srgbClr val="000000">
+                <a:alpha val="63000"/>
+              </a:srgbClr>
+            </a:outerShdw>
+          </a:effectLst>
+        </a:effectStyle>
+      </a:effectStyleLst>
+      <a:bgFillStyleLst>
+        <a:solidFill>
+          <a:schemeClr val="phClr"/>
+        </a:solidFill>
+        <a:solidFill>
+          <a:schemeClr val="phClr">
+            <a:tint val="95000"/>
+            <a:satMod val="170000"/>
+          </a:schemeClr>
+        </a:solidFill>
+        <a:gradFill rotWithShape="true">
+          <a:gsLst>
+            <a:gs pos="0">
+              <a:schemeClr val="phClr">
+                <a:tint val="93000"/>
+                <a:satMod val="150000"/>
+                <a:shade val="98000"/>
+                <a:lumMod val="102000"/>
+              </a:schemeClr>
+            </a:gs>
+            <a:gs pos="50000">
+              <a:schemeClr val="phClr">
+                <a:tint val="98000"/>
+                <a:satMod val="130000"/>
+                <a:shade val="90000"/>
+                <a:lumMod val="103000"/>
+              </a:schemeClr>
+            </a:gs>
+            <a:gs pos="100000">
+              <a:schemeClr val="phClr">
+                <a:shade val="63000"/>
+                <a:satMod val="120000"/>
+              </a:schemeClr>
+            </a:gs>
+          </a:gsLst>
+          <a:lin ang="5400000" scaled="false"/>
+        </a:gradFill>
+      </a:bgFillStyleLst>
+    </a:fmtScheme>
+  </a:themeElements>
+  <a:objectDefaults/>
+  <a:extraClrSchemeLst/>
+</a:theme>
 </file>
</xml_diff>